<commit_message>
Caso de estudio del manipulador, certificaciones, vista previa al compartir y medición de visitas
- Nueva página proyectos/manipulador con resultados de la simulación y enlace a Wokwi
- Sección de certificaciones GWO y Siemens Gamesa
- Imágenes og:image para compartir en WhatsApp y LinkedIn
- GoatCounter preparado (pendiente de crear la cuenta)
- CV corregido: ciclo simulado 5,27 s y herramientas reales del proyecto

Co-Authored-By: Claude Opus 5.5 <noreply@anthropic.com>
</commit_message>
<xml_diff>
--- a/CV_Cristianfer_Silva_Portillo_ATS.docx
+++ b/CV_Cristianfer_Silva_Portillo_ATS.docx
@@ -153,7 +153,7 @@
           <w:sz-cs w:val="28"/>
           <w:spacing w:val="0"/>
         </w:rPr>
-        <w:t xml:space="preserve">Siemens Energy | Coquimbo, Chile | Noviembre 2017 – Presente</w:t>
+        <w:t xml:space="preserve">Siemens Gamesa (Siemens Energy) | Coquimbo, Chile | Noviembre 2017 – Presente</w:t>
       </w:r>
     </w:p>
     <w:p>
@@ -181,6 +181,33 @@
           <w:spacing w:val="0"/>
         </w:rPr>
         <w:t xml:space="preserve">Liderazgo de un equipo de 8 técnicos de mantenimiento en un parque de 50 turbinas eólicas (115 MW): planificación y coordinación de intervenciones, capacitación de personal nuevo y escalamiento de fallas críticas.</w:t>
+      </w:r>
+    </w:p>
+    <w:p>
+      <w:pPr>
+        <w:ind w:left="720" w:first-line="-720"/>
+        <w:spacing w:after="40"/>
+      </w:pPr>
+      <w:r>
+        <w:rPr>
+          <w:rFonts w:ascii="Arial" w:hAnsi="Arial" w:cs="Arial"/>
+          <w:sz w:val="28"/>
+          <w:sz-cs w:val="28"/>
+        </w:rPr>
+        <w:t xml:space="preserve"/>
+        <w:tab/>
+        <w:t xml:space="preserve">•</w:t>
+        <w:tab/>
+        <w:t xml:space="preserve"/>
+      </w:r>
+      <w:r>
+        <w:rPr>
+          <w:rFonts w:ascii="Arial" w:hAnsi="Arial" w:cs="Arial"/>
+          <w:sz w:val="28"/>
+          <w:sz-cs w:val="28"/>
+          <w:spacing w:val="0"/>
+        </w:rPr>
+        <w:t xml:space="preserve">Nombrado Appointed Person (2026) y certificado como evaluador de competencias técnicas (Competent Assessor y Merit Assessor).</w:t>
       </w:r>
     </w:p>
     <w:p>
@@ -399,7 +426,7 @@
           <w:sz-cs w:val="28"/>
           <w:spacing w:val="0"/>
         </w:rPr>
-        <w:t xml:space="preserve">Dimensionamiento de actuadores y pinza: fuerza de agarre con factor de seguridad 2, consumo de aire de 6,2 NL por ciclo y energía cinética en final de carrera.</w:t>
+        <w:t xml:space="preserve">Dimensionamiento de actuadores y pinza: fuerza de agarre con factor de seguridad 2, consumo de aire de 6,8 NL por ciclo y energía de impacto en final de carrera.</w:t>
       </w:r>
     </w:p>
     <w:p>
@@ -453,7 +480,7 @@
           <w:sz-cs w:val="28"/>
           <w:spacing w:val="0"/>
         </w:rPr>
-        <w:t xml:space="preserve">Esquemas neumático (ISO 1219-1) y eléctrico (IEC 60617); diseño validado en simulación con AutoCAD, FluidSIM, CADe_SIMU y PC_SIMU. Tiempo de ciclo de diseño de 5,6 s, 69 % menor que el traslado manual del caso de estudio.</w:t>
+        <w:t xml:space="preserve">Validado en simulación: modelo dinámico en Python con PLC emulado (12 escenarios de falla) y lógica en Wokwi (Arduino Mega como PLC) con 72/72 pruebas superadas. Ciclo de 5,27 s, 71 % menor que el traslado manual del caso de estudio. Esquemas en QElectroTech (IEC 60617) y plano en AutoCAD.</w:t>
       </w:r>
     </w:p>
     <w:p>
@@ -600,6 +627,156 @@
           <w:b/>
           <w:spacing w:val="0"/>
         </w:rPr>
+        <w:t xml:space="preserve">CERTIFICACIONES</w:t>
+      </w:r>
+    </w:p>
+    <w:p>
+      <w:pPr>
+        <w:ind w:left="720" w:first-line="-720"/>
+        <w:spacing w:after="40"/>
+      </w:pPr>
+      <w:r>
+        <w:rPr>
+          <w:rFonts w:ascii="Arial" w:hAnsi="Arial" w:cs="Arial"/>
+          <w:sz w:val="28"/>
+          <w:sz-cs w:val="28"/>
+        </w:rPr>
+        <w:t xml:space="preserve"/>
+        <w:tab/>
+        <w:t xml:space="preserve">•</w:t>
+        <w:tab/>
+        <w:t xml:space="preserve"/>
+      </w:r>
+      <w:r>
+        <w:rPr>
+          <w:rFonts w:ascii="Arial" w:hAnsi="Arial" w:cs="Arial"/>
+          <w:sz w:val="28"/>
+          <w:sz-cs w:val="28"/>
+          <w:spacing w:val="0"/>
+        </w:rPr>
+        <w:t xml:space="preserve">GWO Basic Safety Training (BST): Trabajo en altura, Primeros auxilios, Manejo manual, Prevención de incendios. Vigentes hasta 09/2027.</w:t>
+      </w:r>
+    </w:p>
+    <w:p>
+      <w:pPr>
+        <w:ind w:left="720" w:first-line="-720"/>
+        <w:spacing w:after="40"/>
+      </w:pPr>
+      <w:r>
+        <w:rPr>
+          <w:rFonts w:ascii="Arial" w:hAnsi="Arial" w:cs="Arial"/>
+          <w:sz w:val="28"/>
+          <w:sz-cs w:val="28"/>
+        </w:rPr>
+        <w:t xml:space="preserve"/>
+        <w:tab/>
+        <w:t xml:space="preserve">•</w:t>
+        <w:tab/>
+        <w:t xml:space="preserve"/>
+      </w:r>
+      <w:r>
+        <w:rPr>
+          <w:rFonts w:ascii="Arial" w:hAnsi="Arial" w:cs="Arial"/>
+          <w:sz w:val="28"/>
+          <w:sz-cs w:val="28"/>
+          <w:spacing w:val="0"/>
+        </w:rPr>
+        <w:t xml:space="preserve">GWO Advanced Rescue Training (ART): buje, spinner y pala; nacelle, torre y sótano. Vigente hasta 09/2027.</w:t>
+      </w:r>
+    </w:p>
+    <w:p>
+      <w:pPr>
+        <w:ind w:left="720" w:first-line="-720"/>
+        <w:spacing w:after="40"/>
+      </w:pPr>
+      <w:r>
+        <w:rPr>
+          <w:rFonts w:ascii="Arial" w:hAnsi="Arial" w:cs="Arial"/>
+          <w:sz w:val="28"/>
+          <w:sz-cs w:val="28"/>
+        </w:rPr>
+        <w:t xml:space="preserve"/>
+        <w:tab/>
+        <w:t xml:space="preserve">•</w:t>
+        <w:tab/>
+        <w:t xml:space="preserve"/>
+      </w:r>
+      <w:r>
+        <w:rPr>
+          <w:rFonts w:ascii="Arial" w:hAnsi="Arial" w:cs="Arial"/>
+          <w:sz w:val="28"/>
+          <w:sz-cs w:val="28"/>
+          <w:spacing w:val="0"/>
+        </w:rPr>
+        <w:t xml:space="preserve">Siemens Gamesa: Appointed Person Service (2026); Competent Assessor y Merit Assessor (2026); Commissioning y Troubleshooting, plataforma Siemens geared y controlador WTC3 (2025); Competent Person Service (2021).</w:t>
+      </w:r>
+    </w:p>
+    <w:p>
+      <w:pPr>
+        <w:ind w:left="720" w:first-line="-720"/>
+        <w:spacing w:after="40"/>
+      </w:pPr>
+      <w:r>
+        <w:rPr>
+          <w:rFonts w:ascii="Arial" w:hAnsi="Arial" w:cs="Arial"/>
+          <w:sz w:val="28"/>
+          <w:sz-cs w:val="28"/>
+        </w:rPr>
+        <w:t xml:space="preserve"/>
+        <w:tab/>
+        <w:t xml:space="preserve">•</w:t>
+        <w:tab/>
+        <w:t xml:space="preserve"/>
+      </w:r>
+      <w:r>
+        <w:rPr>
+          <w:rFonts w:ascii="Arial" w:hAnsi="Arial" w:cs="Arial"/>
+          <w:sz w:val="28"/>
+          <w:sz-cs w:val="28"/>
+          <w:spacing w:val="0"/>
+        </w:rPr>
+        <w:t xml:space="preserve">Seguridad: Bloqueo y consignación (LOTO); Seguridad eléctrica general; Inspección de sistemas anticaídas, líneas de vida y puntos de anclaje; Operación de ascensor de servicio Avanti.</w:t>
+      </w:r>
+    </w:p>
+    <w:p>
+      <w:pPr>
+        <w:ind w:left="720" w:first-line="-720"/>
+        <w:spacing w:after="40"/>
+      </w:pPr>
+      <w:r>
+        <w:rPr>
+          <w:rFonts w:ascii="Arial" w:hAnsi="Arial" w:cs="Arial"/>
+          <w:sz w:val="28"/>
+          <w:sz-cs w:val="28"/>
+        </w:rPr>
+        <w:t xml:space="preserve"/>
+        <w:tab/>
+        <w:t xml:space="preserve">•</w:t>
+        <w:tab/>
+        <w:t xml:space="preserve"/>
+      </w:r>
+      <w:r>
+        <w:rPr>
+          <w:rFonts w:ascii="Arial" w:hAnsi="Arial" w:cs="Arial"/>
+          <w:sz w:val="28"/>
+          <w:sz-cs w:val="28"/>
+          <w:spacing w:val="0"/>
+        </w:rPr>
+        <w:t xml:space="preserve">Formación técnica: Basic Technical Training mecánica, eléctrica e hidráulica; Grúa y polipasto; Apriete controlado de pernos; SCADA; SAP Field Service Management.</w:t>
+      </w:r>
+    </w:p>
+    <w:p>
+      <w:pPr>
+        <w:spacing w:after="100"/>
+      </w:pPr>
+      <w:r>
+        <w:rPr>
+          <w:rFonts w:ascii="Arial" w:hAnsi="Arial" w:cs="Arial"/>
+          <w:sz w:val="30"/>
+          <w:sz-cs w:val="30"/>
+          <w:b/>
+          <w:spacing w:val="0"/>
+        </w:rPr>
         <w:t xml:space="preserve">HABILIDADES TÉCNICAS</w:t>
       </w:r>
     </w:p>
@@ -654,7 +831,7 @@
           <w:sz-cs w:val="28"/>
           <w:spacing w:val="0"/>
         </w:rPr>
-        <w:t xml:space="preserve">Electroneumática y diseño: dimensionamiento de actuadores, esquemas ISO 1219-1 e IEC 60617, AutoCAD, FluidSIM, CADe_SIMU, PC_SIMU.</w:t>
+        <w:t xml:space="preserve">Electroneumática y diseño: dimensionamiento de actuadores, esquemas ISO 1219-1 e IEC 60617, AutoCAD, QElectroTech, FluidSIM, Wokwi.</w:t>
       </w:r>
     </w:p>
     <w:p>

</xml_diff>

<commit_message>
Agrega experiencia como operador SCADA en Parque Eólico La Guajira (IMPSA) y actualiza a 10 años en energía eólica
- Nueva entrada de experiencia en la web y en los CV (diseño y ATS, PDF y Word)
- Perfil, portada y metadatos actualizados a 10 años en energía eólica
- Nueva imagen de vista previa al compartir con el estilo del sitio

Co-Authored-By: Claude Opus 5.5 <noreply@anthropic.com>
</commit_message>
<xml_diff>
--- a/CV_Cristianfer_Silva_Portillo_ATS.docx
+++ b/CV_Cristianfer_Silva_Portillo_ATS.docx
@@ -109,7 +109,7 @@
           <w:sz-cs w:val="28"/>
           <w:spacing w:val="0"/>
         </w:rPr>
-        <w:t xml:space="preserve">Estudiante de último semestre de Ingeniería en Automatización y Control Industrial (egreso diciembre 2026) y Técnico de Nivel Superior en Energías Renovables (titulado), con más de 9 años en operación y mantenimiento de turbinas eólicas Siemens G2.101. Lidero un equipo de 8 técnicos en un parque eólico de 50 aerogeneradores (115 MW), aplicando análisis de causa raíz, gestión de seguridad y análisis de datos con Python para mejorar la confiabilidad y la disponibilidad de los equipos. Formación en diseño de sistemas de control: requerimientos, lógica secuencial en PLC, GRAFCET, dimensionamiento electroneumático y seguridad de máquinas. Busco roles de Supervisor de Operaciones, Ingeniero de Confiabilidad, Ingeniero de Mantenimiento o Ingeniero de Automatización.</w:t>
+        <w:t xml:space="preserve">Estudiante de último semestre de Ingeniería en Automatización y Control Industrial (egreso diciembre 2026) y Técnico de Nivel Superior en Energías Renovables (titulado), con 10 años de experiencia en energía eólica: operación y mantenimiento de turbinas Siemens G2.101 desde 2017 y, previamente, operador SCADA en el Parque Eólico La Guajira (Venezuela). Lidero un equipo de 8 técnicos en un parque eólico de 50 aerogeneradores (115 MW), aplicando análisis de causa raíz, gestión de seguridad y análisis de datos con Python para mejorar la confiabilidad y la disponibilidad de los equipos. Formación en diseño de sistemas de control: requerimientos, lógica secuencial en PLC, GRAFCET, dimensionamiento electroneumático y seguridad de máquinas. Busco roles de Supervisor de Operaciones, Ingeniero de Confiabilidad, Ingeniero de Mantenimiento o Ingeniero de Automatización.</w:t>
       </w:r>
     </w:p>
     <w:p>
@@ -316,6 +316,116 @@
           <w:spacing w:val="0"/>
         </w:rPr>
         <w:t xml:space="preserve">Elaboración de reportes técnicos de falla y documentación de intervenciones para la mejora continua del plan de mantenimiento.</w:t>
+      </w:r>
+    </w:p>
+    <w:p>
+      <w:pPr>
+        <w:spacing w:after="40"/>
+      </w:pPr>
+      <w:r>
+        <w:rPr>
+          <w:rFonts w:ascii="Arial" w:hAnsi="Arial" w:cs="Arial"/>
+          <w:sz w:val="28"/>
+          <w:sz-cs w:val="28"/>
+          <w:b/>
+          <w:spacing w:val="0"/>
+        </w:rPr>
+        <w:t xml:space="preserve">Operador SCADA, Parque Eólico La Guajira</w:t>
+      </w:r>
+    </w:p>
+    <w:p>
+      <w:pPr>
+        <w:spacing w:after="80"/>
+      </w:pPr>
+      <w:r>
+        <w:rPr>
+          <w:rFonts w:ascii="Arial" w:hAnsi="Arial" w:cs="Arial"/>
+          <w:sz w:val="28"/>
+          <w:sz-cs w:val="28"/>
+          <w:spacing w:val="0"/>
+        </w:rPr>
+        <w:t xml:space="preserve">IMPSA Caribe, C.A. | Zulia, Venezuela | Abril 2014 – Abril 2015</w:t>
+      </w:r>
+    </w:p>
+    <w:p>
+      <w:pPr>
+        <w:ind w:left="720" w:first-line="-720"/>
+        <w:spacing w:after="40"/>
+      </w:pPr>
+      <w:r>
+        <w:rPr>
+          <w:rFonts w:ascii="Arial" w:hAnsi="Arial" w:cs="Arial"/>
+          <w:sz w:val="28"/>
+          <w:sz-cs w:val="28"/>
+        </w:rPr>
+        <w:t xml:space="preserve"/>
+        <w:tab/>
+        <w:t xml:space="preserve">•</w:t>
+        <w:tab/>
+        <w:t xml:space="preserve"/>
+      </w:r>
+      <w:r>
+        <w:rPr>
+          <w:rFonts w:ascii="Arial" w:hAnsi="Arial" w:cs="Arial"/>
+          <w:sz w:val="28"/>
+          <w:sz-cs w:val="28"/>
+          <w:spacing w:val="0"/>
+        </w:rPr>
+        <w:t xml:space="preserve">Monitoreo en tiempo real mediante SCADA de los 12 aerogeneradores IMPSA IWP-83 del parque (2,1 MW cada uno, accionamiento directo con generador síncrono de imanes permanentes).</w:t>
+      </w:r>
+    </w:p>
+    <w:p>
+      <w:pPr>
+        <w:ind w:left="720" w:first-line="-720"/>
+        <w:spacing w:after="40"/>
+      </w:pPr>
+      <w:r>
+        <w:rPr>
+          <w:rFonts w:ascii="Arial" w:hAnsi="Arial" w:cs="Arial"/>
+          <w:sz w:val="28"/>
+          <w:sz-cs w:val="28"/>
+        </w:rPr>
+        <w:t xml:space="preserve"/>
+        <w:tab/>
+        <w:t xml:space="preserve">•</w:t>
+        <w:tab/>
+        <w:t xml:space="preserve"/>
+      </w:r>
+      <w:r>
+        <w:rPr>
+          <w:rFonts w:ascii="Arial" w:hAnsi="Arial" w:cs="Arial"/>
+          <w:sz w:val="28"/>
+          <w:sz-cs w:val="28"/>
+          <w:spacing w:val="0"/>
+        </w:rPr>
+        <w:t xml:space="preserve">Seguimiento de alarmas y eventos de los aerogeneradores, registro de la operación y aviso al equipo de mantenimiento ante fallas.</w:t>
+      </w:r>
+    </w:p>
+    <w:p>
+      <w:pPr>
+        <w:ind w:left="720" w:first-line="-720"/>
+        <w:spacing w:after="40"/>
+      </w:pPr>
+      <w:r>
+        <w:rPr>
+          <w:rFonts w:ascii="Arial" w:hAnsi="Arial" w:cs="Arial"/>
+          <w:sz w:val="28"/>
+          <w:sz-cs w:val="28"/>
+        </w:rPr>
+        <w:t xml:space="preserve"/>
+        <w:tab/>
+        <w:t xml:space="preserve">•</w:t>
+        <w:tab/>
+        <w:t xml:space="preserve"/>
+      </w:r>
+      <w:r>
+        <w:rPr>
+          <w:rFonts w:ascii="Arial" w:hAnsi="Arial" w:cs="Arial"/>
+          <w:sz w:val="28"/>
+          <w:sz-cs w:val="28"/>
+          <w:spacing w:val="0"/>
+        </w:rPr>
+        <w:t xml:space="preserve">Reconocido por la empresa por su buen desempeño, cumplimiento de obligaciones y responsabilidades, disposición a asumir retos y orientación a la mejora continua.</w:t>
       </w:r>
     </w:p>
     <w:p>

</xml_diff>

<commit_message>
Reposiciona como especialista de campo en parques eólicos: foto, aviso de disponibilidad, plano con turbinas IWP-83 y G2.101, y CV actualizados
Co-Authored-By: Claude Opus 5.5 <noreply@anthropic.com>
</commit_message>
<xml_diff>
--- a/CV_Cristianfer_Silva_Portillo_ATS.docx
+++ b/CV_Cristianfer_Silva_Portillo_ATS.docx
@@ -29,7 +29,7 @@
           <w:b/>
           <w:spacing w:val="0"/>
         </w:rPr>
-        <w:t xml:space="preserve">Estudiante de Ingeniería en Automatización y Control Industrial (último semestre) | Técnico en Energías Renovables (titulado) | Confiabilidad y Mantenimiento de Turbinas Eólicas</w:t>
+        <w:t xml:space="preserve">Especialista de Campo en Parques Eólicos | Ingeniero en Automatización y Control Industrial (titulación diciembre 2026) | Field Service Engineer</w:t>
       </w:r>
       <w:r>
         <w:rPr>
@@ -109,7 +109,7 @@
           <w:sz-cs w:val="28"/>
           <w:spacing w:val="0"/>
         </w:rPr>
-        <w:t xml:space="preserve">Estudiante de último semestre de Ingeniería en Automatización y Control Industrial (egreso diciembre 2026) y Técnico de Nivel Superior en Energías Renovables (titulado), con 10 años de experiencia en energía eólica: operación y mantenimiento de turbinas Siemens G2.101 desde 2017 y, previamente, operador SCADA en el Parque Eólico La Guajira (Venezuela). Lideré un equipo de 8 técnicos en un parque eólico de 50 aerogeneradores (115 MW), aplicando análisis de causa raíz, gestión de seguridad y análisis de datos con Python para mejorar la confiabilidad y la disponibilidad de los equipos. Formación en diseño de sistemas de control: requerimientos, lógica secuencial en PLC, GRAFCET, dimensionamiento electroneumático y seguridad de máquinas. Busco roles de Supervisor de Operaciones, Ingeniero de Confiabilidad, Ingeniero de Mantenimiento o Ingeniero de Automatización.</w:t>
+        <w:t xml:space="preserve">Especialista de campo con 10 años de experiencia en parques eólicos e Ingeniero en Automatización y Control Industrial (titulación en diciembre de 2026), además de Técnico de Nivel Superior en Energías Renovables (titulado). En Siemens Gamesa fui el punto de escalamiento técnico de un parque de 50 aerogeneradores Siemens G2.101 (115 MW): troubleshooting y diagnóstico de fallas complejas en sistemas eléctricos, hidráulicos, de control y convertidores, análisis de causa raíz (RCA) con datos SCADA y Python, y liderazgo de un equipo de 8 técnicos. Antes fui operador SCADA en el Parque Eólico La Guajira (Venezuela). Formación en ingeniería de sistemas de control: requerimientos, lógica secuencial en PLC, GRAFCET, dimensionamiento electroneumático y seguridad de máquinas. Busco roles de Ingeniero Especialista de Campo (Field Service Engineer) en parques eólicos o de Ingeniero de Confiabilidad en energías renovables.</w:t>
       </w:r>
     </w:p>
     <w:p>
@@ -139,7 +139,7 @@
           <w:b/>
           <w:spacing w:val="0"/>
         </w:rPr>
-        <w:t xml:space="preserve">Técnico Troubleshooter, Turbinas Eólicas Siemens G2.101</w:t>
+        <w:t xml:space="preserve">Troubleshooter, Especialista en fallas de turbinas eólicas Siemens G2.101</w:t>
       </w:r>
     </w:p>
     <w:p>
@@ -180,7 +180,88 @@
           <w:sz-cs w:val="28"/>
           <w:spacing w:val="0"/>
         </w:rPr>
-        <w:t xml:space="preserve">Liderazgo de un equipo de 8 técnicos de mantenimiento en un parque de 50 turbinas eólicas (115 MW): planificación y coordinación de intervenciones, capacitación de personal nuevo y escalamiento de fallas críticas.</w:t>
+        <w:t xml:space="preserve">Punto de escalamiento técnico para las fallas críticas de un parque de 50 turbinas eólicas (115 MW): troubleshooting y diagnóstico en sistemas eléctricos, mecánicos, hidráulicos, convertidores de frecuencia (VFD), controlador WTC3 y comunicaciones industriales.</w:t>
+      </w:r>
+    </w:p>
+    <w:p>
+      <w:pPr>
+        <w:ind w:left="720" w:first-line="-720"/>
+        <w:spacing w:after="40"/>
+      </w:pPr>
+      <w:r>
+        <w:rPr>
+          <w:rFonts w:ascii="Arial" w:hAnsi="Arial" w:cs="Arial"/>
+          <w:sz w:val="28"/>
+          <w:sz-cs w:val="28"/>
+        </w:rPr>
+        <w:t xml:space="preserve"/>
+        <w:tab/>
+        <w:t xml:space="preserve">•</w:t>
+        <w:tab/>
+        <w:t xml:space="preserve"/>
+      </w:r>
+      <w:r>
+        <w:rPr>
+          <w:rFonts w:ascii="Arial" w:hAnsi="Arial" w:cs="Arial"/>
+          <w:sz w:val="28"/>
+          <w:sz-cs w:val="28"/>
+          <w:spacing w:val="0"/>
+        </w:rPr>
+        <w:t xml:space="preserve">Análisis de causa raíz (RCA) de fallas recurrentes, con propuestas de acciones correctivas para evitar su repetición y reducir el downtime.</w:t>
+      </w:r>
+    </w:p>
+    <w:p>
+      <w:pPr>
+        <w:ind w:left="720" w:first-line="-720"/>
+        <w:spacing w:after="40"/>
+      </w:pPr>
+      <w:r>
+        <w:rPr>
+          <w:rFonts w:ascii="Arial" w:hAnsi="Arial" w:cs="Arial"/>
+          <w:sz w:val="28"/>
+          <w:sz-cs w:val="28"/>
+        </w:rPr>
+        <w:t xml:space="preserve"/>
+        <w:tab/>
+        <w:t xml:space="preserve">•</w:t>
+        <w:tab/>
+        <w:t xml:space="preserve"/>
+      </w:r>
+      <w:r>
+        <w:rPr>
+          <w:rFonts w:ascii="Arial" w:hAnsi="Arial" w:cs="Arial"/>
+          <w:sz w:val="28"/>
+          <w:sz-cs w:val="28"/>
+          <w:spacing w:val="0"/>
+        </w:rPr>
+        <w:t xml:space="preserve">Análisis de datos operacionales y registros de alarmas SCADA con Python para identificar patrones de falla y priorizar intervenciones según su impacto en la disponibilidad.</w:t>
+      </w:r>
+    </w:p>
+    <w:p>
+      <w:pPr>
+        <w:ind w:left="720" w:first-line="-720"/>
+        <w:spacing w:after="40"/>
+      </w:pPr>
+      <w:r>
+        <w:rPr>
+          <w:rFonts w:ascii="Arial" w:hAnsi="Arial" w:cs="Arial"/>
+          <w:sz w:val="28"/>
+          <w:sz-cs w:val="28"/>
+        </w:rPr>
+        <w:t xml:space="preserve"/>
+        <w:tab/>
+        <w:t xml:space="preserve">•</w:t>
+        <w:tab/>
+        <w:t xml:space="preserve"/>
+      </w:r>
+      <w:r>
+        <w:rPr>
+          <w:rFonts w:ascii="Arial" w:hAnsi="Arial" w:cs="Arial"/>
+          <w:sz w:val="28"/>
+          <w:sz-cs w:val="28"/>
+          <w:spacing w:val="0"/>
+        </w:rPr>
+        <w:t xml:space="preserve">Liderazgo técnico de un equipo de 8 técnicos de mantenimiento: planificación y coordinación de intervenciones y formación de personal nuevo.</w:t>
       </w:r>
     </w:p>
     <w:p>
@@ -208,60 +289,6 @@
           <w:spacing w:val="0"/>
         </w:rPr>
         <w:t xml:space="preserve">Nombrado Appointed Person (2026) y certificado como evaluador de competencias técnicas (Competent Assessor y Merit Assessor).</w:t>
-      </w:r>
-    </w:p>
-    <w:p>
-      <w:pPr>
-        <w:ind w:left="720" w:first-line="-720"/>
-        <w:spacing w:after="40"/>
-      </w:pPr>
-      <w:r>
-        <w:rPr>
-          <w:rFonts w:ascii="Arial" w:hAnsi="Arial" w:cs="Arial"/>
-          <w:sz w:val="28"/>
-          <w:sz-cs w:val="28"/>
-        </w:rPr>
-        <w:t xml:space="preserve"/>
-        <w:tab/>
-        <w:t xml:space="preserve">•</w:t>
-        <w:tab/>
-        <w:t xml:space="preserve"/>
-      </w:r>
-      <w:r>
-        <w:rPr>
-          <w:rFonts w:ascii="Arial" w:hAnsi="Arial" w:cs="Arial"/>
-          <w:sz w:val="28"/>
-          <w:sz-cs w:val="28"/>
-          <w:spacing w:val="0"/>
-        </w:rPr>
-        <w:t xml:space="preserve">Análisis de causa raíz de fallas recurrentes en sistemas eléctricos, mecánicos, hidráulicos, convertidores de frecuencia (VFD) y comunicaciones industriales, con propuestas de acciones correctivas para reducir el downtime.</w:t>
-      </w:r>
-    </w:p>
-    <w:p>
-      <w:pPr>
-        <w:ind w:left="720" w:first-line="-720"/>
-        <w:spacing w:after="40"/>
-      </w:pPr>
-      <w:r>
-        <w:rPr>
-          <w:rFonts w:ascii="Arial" w:hAnsi="Arial" w:cs="Arial"/>
-          <w:sz w:val="28"/>
-          <w:sz-cs w:val="28"/>
-        </w:rPr>
-        <w:t xml:space="preserve"/>
-        <w:tab/>
-        <w:t xml:space="preserve">•</w:t>
-        <w:tab/>
-        <w:t xml:space="preserve"/>
-      </w:r>
-      <w:r>
-        <w:rPr>
-          <w:rFonts w:ascii="Arial" w:hAnsi="Arial" w:cs="Arial"/>
-          <w:sz w:val="28"/>
-          <w:sz-cs w:val="28"/>
-          <w:spacing w:val="0"/>
-        </w:rPr>
-        <w:t xml:space="preserve">Análisis de datos operacionales y registros de alarmas SCADA con Python para identificar patrones de falla y priorizar intervenciones según su impacto en la disponibilidad.</w:t>
       </w:r>
     </w:p>
     <w:p>
@@ -698,7 +725,7 @@
           <w:sz-cs w:val="28"/>
           <w:spacing w:val="0"/>
         </w:rPr>
-        <w:t xml:space="preserve">, Instituto Profesional AIEP (Universidad Andrés Bello), La Serena. 2022 – 2026. Último semestre, egreso previsto diciembre 2026.</w:t>
+        <w:t xml:space="preserve">, Instituto Profesional AIEP (Universidad Andrés Bello), La Serena. 2022 – 2026. Último semestre, titulación prevista diciembre 2026.</w:t>
       </w:r>
     </w:p>
     <w:p>
@@ -914,6 +941,33 @@
           <w:sz-cs w:val="28"/>
           <w:spacing w:val="0"/>
         </w:rPr>
+        <w:t xml:space="preserve">Diagnóstico y confiabilidad: troubleshooting avanzado, análisis de causa raíz (RCA), análisis de fallas, commissioning, controlador WTC3, disponibilidad, downtime, mantenimiento correctivo y preventivo, reportes técnicos, mejora continua.</w:t>
+      </w:r>
+    </w:p>
+    <w:p>
+      <w:pPr>
+        <w:ind w:left="720" w:first-line="-720"/>
+        <w:spacing w:after="40"/>
+      </w:pPr>
+      <w:r>
+        <w:rPr>
+          <w:rFonts w:ascii="Arial" w:hAnsi="Arial" w:cs="Arial"/>
+          <w:sz w:val="28"/>
+          <w:sz-cs w:val="28"/>
+        </w:rPr>
+        <w:t xml:space="preserve"/>
+        <w:tab/>
+        <w:t xml:space="preserve">•</w:t>
+        <w:tab/>
+        <w:t xml:space="preserve"/>
+      </w:r>
+      <w:r>
+        <w:rPr>
+          <w:rFonts w:ascii="Arial" w:hAnsi="Arial" w:cs="Arial"/>
+          <w:sz w:val="28"/>
+          <w:sz-cs w:val="28"/>
+          <w:spacing w:val="0"/>
+        </w:rPr>
         <w:t xml:space="preserve">Sistemas de control: PLC (Ladder, FBD), GRAFCET (IEC 60848), lógica secuencial, SCADA, instrumentación.</w:t>
       </w:r>
     </w:p>
@@ -942,33 +996,6 @@
           <w:spacing w:val="0"/>
         </w:rPr>
         <w:t xml:space="preserve">Electroneumática y diseño: dimensionamiento de actuadores, esquemas ISO 1219-1 e IEC 60617, AutoCAD, QElectroTech, FluidSIM, Wokwi.</w:t>
-      </w:r>
-    </w:p>
-    <w:p>
-      <w:pPr>
-        <w:ind w:left="720" w:first-line="-720"/>
-        <w:spacing w:after="40"/>
-      </w:pPr>
-      <w:r>
-        <w:rPr>
-          <w:rFonts w:ascii="Arial" w:hAnsi="Arial" w:cs="Arial"/>
-          <w:sz w:val="28"/>
-          <w:sz-cs w:val="28"/>
-        </w:rPr>
-        <w:t xml:space="preserve"/>
-        <w:tab/>
-        <w:t xml:space="preserve">•</w:t>
-        <w:tab/>
-        <w:t xml:space="preserve"/>
-      </w:r>
-      <w:r>
-        <w:rPr>
-          <w:rFonts w:ascii="Arial" w:hAnsi="Arial" w:cs="Arial"/>
-          <w:sz w:val="28"/>
-          <w:sz-cs w:val="28"/>
-          <w:spacing w:val="0"/>
-        </w:rPr>
-        <w:t xml:space="preserve">Confiabilidad y mantenimiento: análisis de causa raíz (RCA), análisis de fallas, disponibilidad, downtime, mantenimiento correctivo y preventivo, reportes técnicos, mejora continua.</w:t>
       </w:r>
     </w:p>
     <w:p>
@@ -1078,7 +1105,7 @@
           <w:sz-cs w:val="28"/>
           <w:spacing w:val="0"/>
         </w:rPr>
-        <w:t xml:space="preserve">Liderazgo de equipos técnicos, resolución de problemas, pensamiento analítico, mejora continua, comunicación técnica, trabajo en terreno.</w:t>
+        <w:t xml:space="preserve">Resolución de fallas complejas, liderazgo técnico, pensamiento analítico, mejora continua, comunicación técnica, trabajo en terreno.</w:t>
       </w:r>
     </w:p>
     <w:p>

</xml_diff>